<commit_message>
fix: energy shield innate on upgrade, remove keyword text from descriptions, scientific research random attack
</commit_message>
<xml_diff>
--- a/docs/222.docx
+++ b/docs/222.docx
@@ -2573,55 +2573,47 @@
         <w:rPr>
           <w:rFonts w:hint="eastAsia"/>
         </w:rPr>
-        <w:t>能量护盾</w:t>
-      </w:r>
-      <w:r>
-        <w:rPr>
-          <w:rFonts w:hint="eastAsia"/>
-        </w:rPr>
-        <w:t xml:space="preserve"> (1</w:t>
-      </w:r>
-      <w:r>
-        <w:rPr>
-          <w:rFonts w:hint="eastAsia"/>
-        </w:rPr>
-        <w:t>费</w:t>
-      </w:r>
-      <w:r>
-        <w:rPr>
-          <w:rFonts w:hint="eastAsia"/>
-        </w:rPr>
-        <w:t xml:space="preserve">): </w:t>
-      </w:r>
-      <w:r>
-        <w:rPr>
-          <w:rFonts w:hint="eastAsia"/>
-        </w:rPr>
-        <w:t>固有，获得</w:t>
-      </w:r>
-      <w:r>
-        <w:rPr>
-          <w:rFonts w:hint="eastAsia"/>
-        </w:rPr>
-        <w:t>10</w:t>
-      </w:r>
-      <w:r>
-        <w:rPr>
-          <w:rFonts w:hint="eastAsia"/>
-        </w:rPr>
-        <w:t>点格挡，获得</w:t>
-      </w:r>
-      <w:r>
-        <w:rPr>
-          <w:rFonts w:hint="eastAsia"/>
-        </w:rPr>
-        <w:t>1</w:t>
-      </w:r>
-      <w:r>
-        <w:rPr>
-          <w:rFonts w:hint="eastAsia"/>
-        </w:rPr>
-        <w:t>点敏捷，消耗。</w:t>
+        <w:t>能量护盾 (1费): 获得10点格挡，获得1点敏捷，消耗。（升级：获得固有）</w:t>
+      </w:r>
+      <w:r>
+        <w:rPr>
+          <w:rFonts w:hint="eastAsia"/>
+        </w:rPr>
+      </w:r>
+      <w:r>
+        <w:rPr>
+          <w:rFonts w:hint="eastAsia"/>
+        </w:rPr>
+      </w:r>
+      <w:r>
+        <w:rPr>
+          <w:rFonts w:hint="eastAsia"/>
+        </w:rPr>
+      </w:r>
+      <w:r>
+        <w:rPr>
+          <w:rFonts w:hint="eastAsia"/>
+        </w:rPr>
+      </w:r>
+      <w:r>
+        <w:rPr>
+          <w:rFonts w:hint="eastAsia"/>
+        </w:rPr>
+      </w:r>
+      <w:r>
+        <w:rPr>
+          <w:rFonts w:hint="eastAsia"/>
+        </w:rPr>
+      </w:r>
+      <w:r>
+        <w:rPr>
+          <w:rFonts w:hint="eastAsia"/>
+        </w:rPr>
+      </w:r>
+      <w:r>
+        <w:rPr>
+          <w:rFonts w:hint="eastAsia"/>
+        </w:rPr>
       </w:r>
     </w:p>
     <w:p>

</xml_diff>